<commit_message>
TP Integrador: pide una clase por archivo y estructura en carpetas
Co-Authored-By: Claude Opus 5.5 <noreply@anthropic.com>
</commit_message>
<xml_diff>
--- a/TRABAJOS PRACTICOS/TP INTEGRADOR 25-11/Integrador_enunciado.docx
+++ b/TRABAJOS PRACTICOS/TP INTEGRADOR 25-11/Integrador_enunciado.docx
@@ -330,20 +330,46 @@
         <w:spacing w:after="60"/>
       </w:pPr>
       <w:r>
-        <w:t xml:space="preserve">Organizá el sistema como un proyecto y no como un único script: separalo en módulos, por ejemplo modelos.py (clases), excepciones.py, utilidades.py (decoradores y generadores), archivos.py (lectura y escritura), ia.py (modelo de predicción) y main.py, que importa a los demás y arranca el programa.</w:t>
-      </w:r>
-    </w:p>
-    <w:p>
-      <w:pPr>
-        <w:pStyle w:val="ListParagraph"/>
-        <w:numPr>
-          <w:ilvl w:val="0"/>
-          <w:numId w:val="1"/>
-        </w:numPr>
-        <w:spacing w:after="60"/>
-      </w:pPr>
-      <w:r>
-        <w:t xml:space="preserve">Cada módulo y cada clase deben tener un comentario o docstring que explique qué hacen.</w:t>
+        <w:t xml:space="preserve">Organizá el sistema como un proyecto y no como un único script: cada clase va en su propio archivo .py, y los archivos se agrupan en carpetas (paquetes) según su función. Cada carpeta de código lleva un archivo __init__.py.</w:t>
+      </w:r>
+    </w:p>
+    <w:p>
+      <w:pPr>
+        <w:pStyle w:val="ListParagraph"/>
+        <w:numPr>
+          <w:ilvl w:val="0"/>
+          <w:numId w:val="1"/>
+        </w:numPr>
+        <w:spacing w:after="60"/>
+      </w:pPr>
+      <w:r>
+        <w:t xml:space="preserve">Estructura mínima: main.py en la raíz (arranca el programa); modelos/ (persona.py, exportable_mixin.py, alumno.py, profesor.py); servicios/ (escuela.py); ia/ (predictor_riesgo.py); excepciones/ (errores.py, con todas las excepciones propias); utilidades/ (decoradores.py y archivos.py); datos/ (escuela.txt e historicos.txt) y salida/ (reporte.txt y log.txt).</w:t>
+      </w:r>
+    </w:p>
+    <w:p>
+      <w:pPr>
+        <w:pStyle w:val="ListParagraph"/>
+        <w:numPr>
+          <w:ilvl w:val="0"/>
+          <w:numId w:val="1"/>
+        </w:numPr>
+        <w:spacing w:after="60"/>
+      </w:pPr>
+      <w:r>
+        <w:t xml:space="preserve">Los imports se hacen indicando el paquete, por ejemplo: from modelos.alumno import Alumno.</w:t>
+      </w:r>
+    </w:p>
+    <w:p>
+      <w:pPr>
+        <w:pStyle w:val="ListParagraph"/>
+        <w:numPr>
+          <w:ilvl w:val="0"/>
+          <w:numId w:val="1"/>
+        </w:numPr>
+        <w:spacing w:after="60"/>
+      </w:pPr>
+      <w:r>
+        <w:t xml:space="preserve">Cada archivo y cada clase deben tener un comentario o docstring que explique qué hacen.</w:t>
       </w:r>
     </w:p>
     <w:p>
@@ -535,7 +561,7 @@
         <w:spacing w:after="60"/>
       </w:pPr>
       <w:r>
-        <w:t xml:space="preserve">En excepciones.py definí una excepción base EscuelaError, y que hereden de ella DniInvalidoError, NotaInvalidaError, PersonaDuplicadaError y PersonaNoEncontradaError.</w:t>
+        <w:t xml:space="preserve">En excepciones/errores.py definí una excepción base EscuelaError, y que hereden de ella DniInvalidoError, NotaInvalidaError, PersonaDuplicadaError y PersonaNoEncontradaError.</w:t>
       </w:r>
     </w:p>
     <w:p>
@@ -799,7 +825,7 @@
         <w:spacing w:after="160"/>
       </w:pPr>
       <w:r>
-        <w:t xml:space="preserve">En ia.py definí una clase PredictorRiesgo que implemente, sin librerías de Machine Learning, un clasificador de K-Vecinos Más Cercanos (K-NN), retomando la introducción a IA/ML vista en la Clase 13.</w:t>
+        <w:t xml:space="preserve">En ia/predictor_riesgo.py definí una clase PredictorRiesgo que implemente, sin librerías de Machine Learning, un clasificador de K-Vecinos Más Cercanos (K-NN), retomando la introducción a IA/ML vista en la Clase 13.</w:t>
       </w:r>
     </w:p>
     <w:p>
@@ -884,7 +910,7 @@
         <w:spacing w:after="160"/>
       </w:pPr>
       <w:r>
-        <w:t xml:space="preserve">main.py debe cargar escuela.txt e historicos.txt al iniciar, y mostrar un menú en un bucle while, resuelto con condicionales, con al menos estas opciones:</w:t>
+        <w:t xml:space="preserve">main.py debe cargar datos/escuela.txt y datos/historicos.txt al iniciar, y mostrar un menú en un bucle while, resuelto con condicionales, con al menos estas opciones:</w:t>
       </w:r>
     </w:p>
     <w:p>
@@ -1007,46 +1033,46 @@
         <w:spacing w:after="160"/>
       </w:pPr>
       <w:r>
-        <w:t xml:space="preserve">Dentro de TRABAJOS PRACTICOS/TP INTEGRADOR 25-11/APELLIDO_NOMBRE_DNI/, subí:</w:t>
-      </w:r>
-    </w:p>
-    <w:p>
-      <w:pPr>
-        <w:pStyle w:val="ListParagraph"/>
-        <w:numPr>
-          <w:ilvl w:val="0"/>
-          <w:numId w:val="1"/>
-        </w:numPr>
-        <w:spacing w:after="60"/>
-      </w:pPr>
-      <w:r>
-        <w:t xml:space="preserve">Todos los módulos .py del proyecto (incluido main.py).</w:t>
-      </w:r>
-    </w:p>
-    <w:p>
-      <w:pPr>
-        <w:pStyle w:val="ListParagraph"/>
-        <w:numPr>
-          <w:ilvl w:val="0"/>
-          <w:numId w:val="1"/>
-        </w:numPr>
-        <w:spacing w:after="60"/>
-      </w:pPr>
-      <w:r>
-        <w:t xml:space="preserve">Los archivos de datos escuela.txt e historicos.txt, y requirements.txt.</w:t>
-      </w:r>
-    </w:p>
-    <w:p>
-      <w:pPr>
-        <w:pStyle w:val="ListParagraph"/>
-        <w:numPr>
-          <w:ilvl w:val="0"/>
-          <w:numId w:val="1"/>
-        </w:numPr>
-        <w:spacing w:after="60"/>
-      </w:pPr>
-      <w:r>
-        <w:t xml:space="preserve">Los archivos generados reporte.txt y log.txt.</w:t>
+        <w:t xml:space="preserve">Dentro de TRABAJOS PRACTICOS/TP INTEGRADOR 25-11/APELLIDO_NOMBRE_DNI/, subí el proyecto completo respetando la estructura de carpetas del punto 1:</w:t>
+      </w:r>
+    </w:p>
+    <w:p>
+      <w:pPr>
+        <w:pStyle w:val="ListParagraph"/>
+        <w:numPr>
+          <w:ilvl w:val="0"/>
+          <w:numId w:val="1"/>
+        </w:numPr>
+        <w:spacing w:after="60"/>
+      </w:pPr>
+      <w:r>
+        <w:t xml:space="preserve">main.py y requirements.txt en la raíz de tu carpeta.</w:t>
+      </w:r>
+    </w:p>
+    <w:p>
+      <w:pPr>
+        <w:pStyle w:val="ListParagraph"/>
+        <w:numPr>
+          <w:ilvl w:val="0"/>
+          <w:numId w:val="1"/>
+        </w:numPr>
+        <w:spacing w:after="60"/>
+      </w:pPr>
+      <w:r>
+        <w:t xml:space="preserve">Las carpetas de código modelos/, servicios/, ia/, excepciones/ y utilidades/, cada una con su __init__.py.</w:t>
+      </w:r>
+    </w:p>
+    <w:p>
+      <w:pPr>
+        <w:pStyle w:val="ListParagraph"/>
+        <w:numPr>
+          <w:ilvl w:val="0"/>
+          <w:numId w:val="1"/>
+        </w:numPr>
+        <w:spacing w:after="60"/>
+      </w:pPr>
+      <w:r>
+        <w:t xml:space="preserve">datos/ con escuela.txt e historicos.txt, y salida/ con los reporte.txt y log.txt generados.</w:t>
       </w:r>
     </w:p>
     <w:p>

</xml_diff>